<commit_message>
feat: new box check
</commit_message>
<xml_diff>
--- a/code/RuoYi-Vue-Plus/ruoyi-modules/ruoyi-lqg/src/main/resources/lqg/doc-templates/organoid_qc.docx
+++ b/code/RuoYi-Vue-Plus/ruoyi-modules/ruoyi-lqg/src/main/resources/lqg/doc-templates/organoid_qc.docx
@@ -63,7 +63,7 @@
             </w:pPr>
             <w:r>
               <w:rPr>
-                <w:rFonts w:ascii="Tinos" w:hAnsi="Tinos" w:eastAsia="Noto Serif SC" w:cs="Tinos"/>
+                <w:rFonts w:ascii="Times New Roman" w:hAnsi="Times New Roman" w:eastAsia="宋体" w:cs="Times New Roman"/>
                 <w:b/>
                 <w:bCs/>
                 <w:color w:val="000000"/>
@@ -122,7 +122,7 @@
               <w:jc w:val="center"/>
               <w:textAlignment w:val="auto"/>
               <w:rPr>
-                <w:rFonts w:hint="default" w:ascii="Tinos" w:hAnsi="Tinos" w:eastAsia="Noto Serif SC" w:cs="Tinos"/>
+                <w:rFonts w:hint="default" w:ascii="Times New Roman" w:hAnsi="Times New Roman" w:eastAsia="宋体" w:cs="Times New Roman"/>
                 <w:color w:val="000000"/>
                 <w:sz w:val="24"/>
                 <w:szCs w:val="24"/>
@@ -130,7 +130,7 @@
             </w:pPr>
             <w:r>
               <w:rPr>
-                <w:rFonts w:hint="default" w:ascii="Tinos" w:hAnsi="Tinos" w:eastAsia="Noto Serif SC" w:cs="Tinos"/>
+                <w:rFonts w:hint="default" w:ascii="Times New Roman" w:hAnsi="Times New Roman" w:eastAsia="宋体" w:cs="Times New Roman"/>
                 <w:color w:val="000000"/>
                 <w:sz w:val="24"/>
                 <w:szCs w:val="24"/>
@@ -151,30 +151,27 @@
             </w:pPr>
             <w:r>
               <w:rPr>
-                <w:rFonts w:hint="eastAsia" w:ascii="Tinos" w:hAnsi="Tinos" w:eastAsia="Noto Serif SC" w:cs="Tinos"/>
-                <w:sz w:val="24"/>
-                <w:szCs w:val="24"/>
-                <w:highlight w:val="green"/>
+                <w:rFonts w:hint="eastAsia" w:ascii="Times New Roman" w:hAnsi="Times New Roman" w:eastAsia="宋体" w:cs="Times New Roman"/>
+                <w:sz w:val="24"/>
+                <w:szCs w:val="24"/>
                 <w:lang w:val="en-US" w:eastAsia="zh-CN"/>
               </w:rPr>
               <w:t>{{@organoid_observe_img1}}</w:t>
             </w:r>
             <w:r>
               <w:rPr>
-                <w:rFonts w:hint="eastAsia" w:ascii="Tinos" w:hAnsi="Tinos" w:eastAsia="Noto Serif SC" w:cs="Tinos"/>
-                <w:sz w:val="24"/>
-                <w:szCs w:val="24"/>
-                <w:highlight w:val="green"/>
+                <w:rFonts w:hint="eastAsia" w:ascii="Times New Roman" w:hAnsi="Times New Roman" w:eastAsia="宋体" w:cs="Times New Roman"/>
+                <w:sz w:val="24"/>
+                <w:szCs w:val="24"/>
                 <w:lang w:val="en-US" w:eastAsia="zh-CN"/>
               </w:rPr>
               <w:t>{{@organoid_observe_img2}}</w:t>
             </w:r>
             <w:r>
               <w:rPr>
-                <w:rFonts w:hint="eastAsia" w:ascii="Tinos" w:hAnsi="Tinos" w:eastAsia="Noto Serif SC" w:cs="Tinos"/>
-                <w:sz w:val="24"/>
-                <w:szCs w:val="24"/>
-                <w:highlight w:val="green"/>
+                <w:rFonts w:hint="eastAsia" w:ascii="Times New Roman" w:hAnsi="Times New Roman" w:eastAsia="宋体" w:cs="Times New Roman"/>
+                <w:sz w:val="24"/>
+                <w:szCs w:val="24"/>
                 <w:lang w:val="en-US" w:eastAsia="zh-CN"/>
               </w:rPr>
               <w:t>{{@organoid_observe_img3}}</w:t>
@@ -231,7 +228,7 @@
               <w:jc w:val="center"/>
               <w:textAlignment w:val="auto"/>
               <w:rPr>
-                <w:rFonts w:hint="default" w:ascii="Tinos" w:hAnsi="Tinos" w:eastAsia="Noto Serif SC" w:cs="Tinos"/>
+                <w:rFonts w:hint="default" w:ascii="Times New Roman" w:hAnsi="Times New Roman" w:eastAsia="宋体" w:cs="Times New Roman"/>
                 <w:color w:val="000000"/>
                 <w:sz w:val="24"/>
                 <w:szCs w:val="24"/>
@@ -239,7 +236,7 @@
             </w:pPr>
             <w:r>
               <w:rPr>
-                <w:rFonts w:hint="default" w:ascii="Tinos" w:hAnsi="Tinos" w:eastAsia="Noto Serif SC" w:cs="Tinos"/>
+                <w:rFonts w:hint="default" w:ascii="Times New Roman" w:hAnsi="Times New Roman" w:eastAsia="宋体" w:cs="Times New Roman"/>
                 <w:color w:val="000000"/>
                 <w:sz w:val="24"/>
                 <w:szCs w:val="24"/>
@@ -261,7 +258,7 @@
             </w:pPr>
             <w:r>
               <w:rPr>
-                <w:rFonts w:hint="default" w:ascii="Tinos" w:hAnsi="Tinos" w:eastAsia="Noto Serif SC" w:cs="Tinos"/>
+                <w:rFonts w:hint="default" w:ascii="Times New Roman" w:hAnsi="Times New Roman" w:eastAsia="宋体" w:cs="Times New Roman"/>
                 <w:sz w:val="24"/>
                 <w:szCs w:val="24"/>
               </w:rPr>
@@ -317,7 +314,7 @@
               <w:jc w:val="center"/>
               <w:textAlignment w:val="auto"/>
               <w:rPr>
-                <w:rFonts w:hint="default" w:ascii="Tinos" w:hAnsi="Tinos" w:eastAsia="Noto Serif SC" w:cs="Tinos"/>
+                <w:rFonts w:hint="default" w:ascii="Times New Roman" w:hAnsi="Times New Roman" w:eastAsia="宋体" w:cs="Times New Roman"/>
                 <w:color w:val="000000"/>
                 <w:sz w:val="24"/>
                 <w:szCs w:val="24"/>
@@ -325,7 +322,7 @@
             </w:pPr>
             <w:r>
               <w:rPr>
-                <w:rFonts w:hint="default" w:ascii="Tinos" w:hAnsi="Tinos" w:eastAsia="Noto Serif SC" w:cs="Tinos"/>
+                <w:rFonts w:hint="default" w:ascii="Times New Roman" w:hAnsi="Times New Roman" w:eastAsia="宋体" w:cs="Times New Roman"/>
                 <w:color w:val="000000"/>
                 <w:sz w:val="24"/>
                 <w:szCs w:val="24"/>
@@ -347,7 +344,7 @@
             </w:pPr>
             <w:r>
               <w:rPr>
-                <w:rFonts w:hint="default" w:ascii="Tinos" w:hAnsi="Tinos" w:eastAsia="Noto Serif SC" w:cs="Tinos"/>
+                <w:rFonts w:hint="default" w:ascii="Times New Roman" w:hAnsi="Times New Roman" w:eastAsia="宋体" w:cs="Times New Roman"/>
                 <w:sz w:val="24"/>
                 <w:szCs w:val="24"/>
               </w:rPr>
@@ -403,7 +400,7 @@
               <w:jc w:val="center"/>
               <w:textAlignment w:val="auto"/>
               <w:rPr>
-                <w:rFonts w:hint="default" w:ascii="Tinos" w:hAnsi="Tinos" w:eastAsia="Noto Serif SC" w:cs="Tinos"/>
+                <w:rFonts w:hint="default" w:ascii="Times New Roman" w:hAnsi="Times New Roman" w:eastAsia="宋体" w:cs="Times New Roman"/>
                 <w:color w:val="000000"/>
                 <w:sz w:val="24"/>
                 <w:szCs w:val="24"/>
@@ -411,7 +408,7 @@
             </w:pPr>
             <w:r>
               <w:rPr>
-                <w:rFonts w:hint="default" w:ascii="Tinos" w:hAnsi="Tinos" w:eastAsia="Noto Serif SC" w:cs="Tinos"/>
+                <w:rFonts w:hint="default" w:ascii="Times New Roman" w:hAnsi="Times New Roman" w:eastAsia="宋体" w:cs="Times New Roman"/>
                 <w:color w:val="000000"/>
                 <w:sz w:val="24"/>
                 <w:szCs w:val="24"/>
@@ -433,7 +430,7 @@
             </w:pPr>
             <w:r>
               <w:rPr>
-                <w:rFonts w:hint="default" w:ascii="Tinos" w:hAnsi="Tinos" w:eastAsia="Noto Serif SC" w:cs="Tinos"/>
+                <w:rFonts w:hint="default" w:ascii="Times New Roman" w:hAnsi="Times New Roman" w:eastAsia="宋体" w:cs="Times New Roman"/>
                 <w:sz w:val="24"/>
                 <w:szCs w:val="24"/>
               </w:rPr>
@@ -489,7 +486,7 @@
               <w:jc w:val="center"/>
               <w:textAlignment w:val="auto"/>
               <w:rPr>
-                <w:rFonts w:hint="default" w:ascii="Tinos" w:hAnsi="Tinos" w:eastAsia="Noto Serif SC" w:cs="Tinos"/>
+                <w:rFonts w:hint="default" w:ascii="Times New Roman" w:hAnsi="Times New Roman" w:eastAsia="宋体" w:cs="Times New Roman"/>
                 <w:color w:val="000000"/>
                 <w:sz w:val="24"/>
                 <w:szCs w:val="24"/>
@@ -497,7 +494,7 @@
             </w:pPr>
             <w:r>
               <w:rPr>
-                <w:rFonts w:hint="default" w:ascii="Tinos" w:hAnsi="Tinos" w:eastAsia="Noto Serif SC" w:cs="Tinos"/>
+                <w:rFonts w:hint="default" w:ascii="Times New Roman" w:hAnsi="Times New Roman" w:eastAsia="宋体" w:cs="Times New Roman"/>
                 <w:color w:val="000000"/>
                 <w:sz w:val="24"/>
                 <w:szCs w:val="24"/>
@@ -519,7 +516,7 @@
             </w:pPr>
             <w:r>
               <w:rPr>
-                <w:rFonts w:hint="default" w:ascii="Tinos" w:hAnsi="Tinos" w:eastAsia="Noto Serif SC" w:cs="Tinos"/>
+                <w:rFonts w:hint="default" w:ascii="Times New Roman" w:hAnsi="Times New Roman" w:eastAsia="宋体" w:cs="Times New Roman"/>
                 <w:sz w:val="24"/>
                 <w:szCs w:val="24"/>
               </w:rPr>
@@ -575,7 +572,7 @@
               <w:jc w:val="center"/>
               <w:textAlignment w:val="auto"/>
               <w:rPr>
-                <w:rFonts w:hint="default" w:ascii="Tinos" w:hAnsi="Tinos" w:eastAsia="Noto Serif SC" w:cs="Tinos"/>
+                <w:rFonts w:hint="default" w:ascii="Times New Roman" w:hAnsi="Times New Roman" w:eastAsia="宋体" w:cs="Times New Roman"/>
                 <w:color w:val="000000"/>
                 <w:sz w:val="24"/>
                 <w:szCs w:val="24"/>
@@ -583,7 +580,7 @@
             </w:pPr>
             <w:r>
               <w:rPr>
-                <w:rFonts w:hint="default" w:ascii="Tinos" w:hAnsi="Tinos" w:eastAsia="Noto Serif SC" w:cs="Tinos"/>
+                <w:rFonts w:hint="default" w:ascii="Times New Roman" w:hAnsi="Times New Roman" w:eastAsia="宋体" w:cs="Times New Roman"/>
                 <w:color w:val="000000"/>
                 <w:sz w:val="24"/>
                 <w:szCs w:val="24"/>
@@ -605,7 +602,7 @@
             </w:pPr>
             <w:r>
               <w:rPr>
-                <w:rFonts w:hint="default" w:ascii="Tinos" w:hAnsi="Tinos" w:eastAsia="Noto Serif SC" w:cs="Tinos"/>
+                <w:rFonts w:hint="default" w:ascii="Times New Roman" w:hAnsi="Times New Roman" w:eastAsia="宋体" w:cs="Times New Roman"/>
                 <w:sz w:val="24"/>
                 <w:szCs w:val="24"/>
               </w:rPr>
@@ -631,7 +628,7 @@
   <w:docDefaults>
     <w:rPrDefault>
       <w:rPr>
-        <w:rFonts w:ascii="Tinos" w:hAnsi="Tinos" w:eastAsia="Noto Serif SC" w:cs="Tinos"/>
+        <w:rFonts w:asciiTheme="minorHAnsi" w:hAnsiTheme="minorHAnsi" w:eastAsiaTheme="minorEastAsia" w:cstheme="minorBidi"/>
       </w:rPr>
     </w:rPrDefault>
     <w:pPrDefault/>
@@ -895,7 +892,7 @@
       <w:jc w:val="both"/>
     </w:pPr>
     <w:rPr>
-      <w:rFonts w:ascii="Tinos" w:hAnsi="Tinos" w:eastAsia="Noto Serif SC" w:cs="Tinos"/>
+      <w:rFonts w:asciiTheme="minorHAnsi" w:hAnsiTheme="minorHAnsi" w:eastAsiaTheme="minorEastAsia" w:cstheme="minorBidi"/>
       <w:kern w:val="2"/>
       <w:sz w:val="21"/>
       <w:szCs w:val="24"/>
@@ -1066,12 +1063,12 @@
     </a:clrScheme>
     <a:fontScheme name="WPS">
       <a:majorFont>
-        <a:latin typeface="Tinos"/>
-        <a:ea typeface="Noto Serif SC"/>
-        <a:cs typeface="Tinos"/>
+        <a:latin typeface="Calibri Light"/>
+        <a:ea typeface=""/>
+        <a:cs typeface=""/>
         <a:font script="Jpan" typeface="游ゴシック Light"/>
         <a:font script="Hang" typeface="맑은 고딕"/>
-        <a:font script="Hans" typeface="Noto Serif SC"/>
+        <a:font script="Hans" typeface="宋体"/>
         <a:font script="Hant" typeface="新細明體"/>
         <a:font script="Arab" typeface="Times New Roman"/>
         <a:font script="Hebr" typeface="Times New Roman"/>
@@ -1101,12 +1098,12 @@
         <a:font script="Geor" typeface="Sylfaen"/>
       </a:majorFont>
       <a:minorFont>
-        <a:latin typeface="Tinos"/>
-        <a:ea typeface="Noto Serif SC"/>
-        <a:cs typeface="Tinos"/>
+        <a:latin typeface="Calibri"/>
+        <a:ea typeface=""/>
+        <a:cs typeface=""/>
         <a:font script="Jpan" typeface="游明朝"/>
         <a:font script="Hang" typeface="맑은 고딕"/>
-        <a:font script="Hans" typeface="Noto Serif SC"/>
+        <a:font script="Hans" typeface="宋体"/>
         <a:font script="Hant" typeface="新細明體"/>
         <a:font script="Arab" typeface="Arial"/>
         <a:font script="Hebr" typeface="Arial"/>

</xml_diff>